<commit_message>
Satış materyallerini farklılaştırma anlatısıyla güncelle
</commit_message>
<xml_diff>
--- a/pazarlama/OtoHafiza_Teklif_ve_Fiyat_Ilk20.docx
+++ b/pazarlama/OtoHafiza_Teklif_ve_Fiyat_Ilk20.docx
@@ -50,9 +50,9 @@
       <w:pPr>
         <w:pStyle w:val="Heading1"/>
       </w:pPr>
-      <w:bookmarkStart w:id="20" w:name="X803e6f286e7717a21609e3ce931629df818f134"/>
-      <w:r>
-        <w:t xml:space="preserve">Bakıma Gelen Müşteriyi 6 Ay Sonra Geri Getiriyoruz</w:t>
+      <w:bookmarkStart w:id="20" w:name="X481998285c8d24ba54bc5c21879442517e81949"/>
+      <w:r>
+        <w:t xml:space="preserve">Bakıma Gelen Müşteriyi Unutmadan Geri Çağırıyoruz</w:t>
       </w:r>
       <w:bookmarkEnd w:id="20"/>
     </w:p>
@@ -92,7 +92,7 @@
         <w:t xml:space="preserve"> </w:t>
       </w:r>
       <w:r>
-        <w:t xml:space="preserve">Her araca özel, su geçirmez bir QR etiket veriyoruz — kaputun altına ya da cama yapıştırılır.</w:t>
+        <w:t xml:space="preserve">Kendi yazıcınızdan hemen basabilirsiniz — bugün başlarsınız, kargo beklemezsiniz. Dayanıklı, su geçirmez etiket isterseniz onu da ayrıca sipariş edebilirsiniz.</w:t>
       </w:r>
     </w:p>
     <w:p>
@@ -177,6 +177,27 @@
         <w:rPr>
           <w:b/>
         </w:rPr>
+        <w:t xml:space="preserve">Bugün başlarsınız.</w:t>
+      </w:r>
+      <w:r>
+        <w:t xml:space="preserve"> </w:t>
+      </w:r>
+      <w:r>
+        <w:t xml:space="preserve">Etiketinizi kendi yazıcınızdan hemen basarsınız, kargo/kurulum beklemezsiniz.</w:t>
+      </w:r>
+    </w:p>
+    <w:p>
+      <w:pPr>
+        <w:numPr>
+          <w:ilvl w:val="0"/>
+          <w:numId w:val="1002"/>
+        </w:numPr>
+        <w:pStyle w:val="Compact"/>
+      </w:pPr>
+      <w:r>
+        <w:rPr>
+          <w:b/>
+        </w:rPr>
         <w:t xml:space="preserve">Müşteri kaybetmezsiniz.</w:t>
       </w:r>
       <w:r>
@@ -184,6 +205,27 @@
       </w:r>
       <w:r>
         <w:t xml:space="preserve">Geçmişi elinde tutan dükkan, müşterinin bir dahaki sefer de gideceği dükkan olur.</w:t>
+      </w:r>
+    </w:p>
+    <w:p>
+      <w:pPr>
+        <w:numPr>
+          <w:ilvl w:val="0"/>
+          <w:numId w:val="1002"/>
+        </w:numPr>
+        <w:pStyle w:val="Compact"/>
+      </w:pPr>
+      <w:r>
+        <w:rPr>
+          <w:b/>
+        </w:rPr>
+        <w:t xml:space="preserve">Doğrudan bize ulaşırsınız.</w:t>
+      </w:r>
+      <w:r>
+        <w:t xml:space="preserve"> </w:t>
+      </w:r>
+      <w:r>
+        <w:t xml:space="preserve">Anonim bir çağrı merkezi değil — sorunuz olduğunda WhatsApp’tan gerçek bir kişiyle konuşursunuz.</w:t>
       </w:r>
     </w:p>
     <w:p>

</xml_diff>